<commit_message>
docs: add project documentation for Group 5 waroeng mie ayam
</commit_message>
<xml_diff>
--- a/docs/Kelompok 5 waroeng mie ayam mastono mahesa hakim atikah jelita.docx
+++ b/docs/Kelompok 5 waroeng mie ayam mastono mahesa hakim atikah jelita.docx
@@ -296,7 +296,7 @@
           <w:tab w:val="left" w:pos="4253"/>
         </w:tabs>
         <w:spacing w:before="1"/>
-        <w:ind w:left="2520" w:right="3314"/>
+        <w:ind w:left="2268" w:right="3314"/>
         <w:jc w:val="both"/>
       </w:pPr>
       <w:r>
@@ -327,6 +327,12 @@
         <w:t xml:space="preserve"> </w:t>
       </w:r>
       <w:r>
+        <w:rPr>
+          <w:spacing w:val="80"/>
+        </w:rPr>
+        <w:t xml:space="preserve">  </w:t>
+      </w:r>
+      <w:r>
         <w:t>-</w:t>
       </w:r>
       <w:r>
@@ -354,6 +360,12 @@
         <w:t xml:space="preserve"> </w:t>
       </w:r>
       <w:r>
+        <w:rPr>
+          <w:spacing w:val="40"/>
+        </w:rPr>
+        <w:t xml:space="preserve">   </w:t>
+      </w:r>
+      <w:r>
         <w:t>-</w:t>
       </w:r>
       <w:r>
@@ -387,37 +399,40 @@
         <w:rPr>
           <w:spacing w:val="40"/>
         </w:rPr>
+        <w:t xml:space="preserve">  </w:t>
+      </w:r>
+      <w:r>
+        <w:rPr>
+          <w:spacing w:val="-8"/>
+        </w:rPr>
+        <w:t xml:space="preserve">- </w:t>
+      </w:r>
+      <w:r>
+        <w:t>230504051 Nur</w:t>
+      </w:r>
+      <w:r>
+        <w:rPr>
+          <w:spacing w:val="-13"/>
+        </w:rPr>
         <w:t xml:space="preserve"> </w:t>
       </w:r>
       <w:r>
-        <w:t>-</w:t>
-      </w:r>
-      <w:r>
-        <w:rPr>
-          <w:spacing w:val="-8"/>
-        </w:rPr>
-        <w:t xml:space="preserve"> </w:t>
-      </w:r>
-      <w:r>
-        <w:t>230504051 Nur</w:t>
-      </w:r>
-      <w:r>
-        <w:rPr>
-          <w:spacing w:val="-13"/>
-        </w:rPr>
-        <w:t xml:space="preserve"> </w:t>
-      </w:r>
-      <w:r>
         <w:t>Atikah</w:t>
       </w:r>
       <w:r>
-        <w:tab/>
+        <w:t xml:space="preserve">               </w:t>
       </w:r>
       <w:r>
         <w:rPr>
           <w:spacing w:val="-2"/>
         </w:rPr>
-        <w:t>-230504054</w:t>
+        <w:t xml:space="preserve">- </w:t>
+      </w:r>
+      <w:r>
+        <w:rPr>
+          <w:spacing w:val="-2"/>
+        </w:rPr>
+        <w:t>230504054</w:t>
       </w:r>
     </w:p>
     <w:p>
@@ -5185,7 +5200,7 @@
           <w:noProof/>
         </w:rPr>
         <w:drawing>
-          <wp:anchor distT="0" distB="0" distL="114300" distR="114300" simplePos="0" relativeHeight="251635200" behindDoc="1" locked="0" layoutInCell="1" allowOverlap="1" wp14:anchorId="768207C5" wp14:editId="19BB3009">
+          <wp:anchor distT="0" distB="0" distL="114300" distR="114300" simplePos="0" relativeHeight="251635200" behindDoc="1" locked="0" layoutInCell="1" allowOverlap="1" wp14:anchorId="768207C5" wp14:editId="72E25E2F">
             <wp:simplePos x="0" y="0"/>
             <wp:positionH relativeFrom="column">
               <wp:posOffset>571500</wp:posOffset>
@@ -5465,7 +5480,7 @@
           <w:noProof/>
         </w:rPr>
         <w:drawing>
-          <wp:anchor distT="0" distB="0" distL="114300" distR="114300" simplePos="0" relativeHeight="251664896" behindDoc="1" locked="0" layoutInCell="1" allowOverlap="1" wp14:anchorId="3433B349" wp14:editId="6ACEC728">
+          <wp:anchor distT="0" distB="0" distL="114300" distR="114300" simplePos="0" relativeHeight="251664896" behindDoc="1" locked="0" layoutInCell="1" allowOverlap="1" wp14:anchorId="3433B349" wp14:editId="7BEDF524">
             <wp:simplePos x="0" y="0"/>
             <wp:positionH relativeFrom="column">
               <wp:posOffset>1637666</wp:posOffset>
@@ -5543,7 +5558,7 @@
           <w:noProof/>
         </w:rPr>
         <w:drawing>
-          <wp:anchor distT="0" distB="0" distL="114300" distR="114300" simplePos="0" relativeHeight="251679232" behindDoc="1" locked="0" layoutInCell="1" allowOverlap="1" wp14:anchorId="51499E96" wp14:editId="4E88BDFB">
+          <wp:anchor distT="0" distB="0" distL="114300" distR="114300" simplePos="0" relativeHeight="251679232" behindDoc="1" locked="0" layoutInCell="1" allowOverlap="1" wp14:anchorId="51499E96" wp14:editId="78B96894">
             <wp:simplePos x="0" y="0"/>
             <wp:positionH relativeFrom="column">
               <wp:posOffset>1503365</wp:posOffset>

</xml_diff>

<commit_message>
merubah foto depan warung
</commit_message>
<xml_diff>
--- a/docs/Kelompok 5 waroeng mie ayam mastono mahesa hakim atikah jelita.docx
+++ b/docs/Kelompok 5 waroeng mie ayam mastono mahesa hakim atikah jelita.docx
@@ -4990,10 +4990,70 @@
           <w:noProof/>
         </w:rPr>
         <w:lastRenderedPageBreak/>
+        <w:drawing>
+          <wp:anchor distT="0" distB="0" distL="114300" distR="114300" simplePos="0" relativeHeight="251659776" behindDoc="1" locked="0" layoutInCell="1" allowOverlap="1" wp14:anchorId="454C4678" wp14:editId="7E2EDD21">
+            <wp:simplePos x="0" y="0"/>
+            <wp:positionH relativeFrom="column">
+              <wp:posOffset>476250</wp:posOffset>
+            </wp:positionH>
+            <wp:positionV relativeFrom="paragraph">
+              <wp:posOffset>1</wp:posOffset>
+            </wp:positionV>
+            <wp:extent cx="4627373" cy="2501900"/>
+            <wp:effectExtent l="0" t="0" r="1905" b="0"/>
+            <wp:wrapNone/>
+            <wp:docPr id="1613858928" name="Picture 5"/>
+            <wp:cNvGraphicFramePr>
+              <a:graphicFrameLocks xmlns:a="http://schemas.openxmlformats.org/drawingml/2006/main" noChangeAspect="1"/>
+            </wp:cNvGraphicFramePr>
+            <a:graphic xmlns:a="http://schemas.openxmlformats.org/drawingml/2006/main">
+              <a:graphicData uri="http://schemas.openxmlformats.org/drawingml/2006/picture">
+                <pic:pic xmlns:pic="http://schemas.openxmlformats.org/drawingml/2006/picture">
+                  <pic:nvPicPr>
+                    <pic:cNvPr id="1613858928" name="Picture 1613858928"/>
+                    <pic:cNvPicPr/>
+                  </pic:nvPicPr>
+                  <pic:blipFill>
+                    <a:blip r:embed="rId9" cstate="print">
+                      <a:extLst>
+                        <a:ext uri="{28A0092B-C50C-407E-A947-70E740481C1C}">
+                          <a14:useLocalDpi xmlns:a14="http://schemas.microsoft.com/office/drawing/2010/main" val="0"/>
+                        </a:ext>
+                      </a:extLst>
+                    </a:blip>
+                    <a:stretch>
+                      <a:fillRect/>
+                    </a:stretch>
+                  </pic:blipFill>
+                  <pic:spPr>
+                    <a:xfrm>
+                      <a:off x="0" y="0"/>
+                      <a:ext cx="4628264" cy="2502382"/>
+                    </a:xfrm>
+                    <a:prstGeom prst="rect">
+                      <a:avLst/>
+                    </a:prstGeom>
+                  </pic:spPr>
+                </pic:pic>
+              </a:graphicData>
+            </a:graphic>
+            <wp14:sizeRelH relativeFrom="margin">
+              <wp14:pctWidth>0</wp14:pctWidth>
+            </wp14:sizeRelH>
+            <wp14:sizeRelV relativeFrom="margin">
+              <wp14:pctHeight>0</wp14:pctHeight>
+            </wp14:sizeRelV>
+          </wp:anchor>
+        </w:drawing>
+      </w:r>
+      <w:r>
+        <w:rPr>
+          <w:noProof/>
+        </w:rPr>
         <mc:AlternateContent>
           <mc:Choice Requires="wps">
             <w:drawing>
-              <wp:anchor distT="0" distB="0" distL="114300" distR="114300" simplePos="0" relativeHeight="251666944" behindDoc="1" locked="0" layoutInCell="1" allowOverlap="1" wp14:anchorId="5CEA840E" wp14:editId="71FD17D0">
+              <wp:anchor distT="0" distB="0" distL="114300" distR="114300" simplePos="0" relativeHeight="251657728" behindDoc="1" locked="0" layoutInCell="1" allowOverlap="1" wp14:anchorId="5CEA840E" wp14:editId="2E37586A">
                 <wp:simplePos x="0" y="0"/>
                 <wp:positionH relativeFrom="column">
                   <wp:posOffset>571500</wp:posOffset>
@@ -5046,7 +5106,15 @@
                                 <w:iCs w:val="0"/>
                                 <w:color w:val="auto"/>
                               </w:rPr>
-                              <w:t xml:space="preserve">Gambar 3. </w:t>
+                              <w:t xml:space="preserve">Gambar </w:t>
+                            </w:r>
+                            <w:r>
+                              <w:rPr>
+                                <w:i w:val="0"/>
+                                <w:iCs w:val="0"/>
+                                <w:color w:val="auto"/>
+                              </w:rPr>
+                              <w:t xml:space="preserve">3. </w:t>
                             </w:r>
                             <w:r>
                               <w:rPr>
@@ -5114,7 +5182,7 @@
           </mc:Choice>
           <mc:Fallback>
             <w:pict>
-              <v:shape w14:anchorId="5CEA840E" id="_x0000_s1027" type="#_x0000_t202" style="position:absolute;left:0;text-align:left;margin-left:45pt;margin-top:199.85pt;width:350pt;height:.05pt;z-index:-251649536;visibility:visible;mso-wrap-style:square;mso-wrap-distance-left:9pt;mso-wrap-distance-top:0;mso-wrap-distance-right:9pt;mso-wrap-distance-bottom:0;mso-position-horizontal:absolute;mso-position-horizontal-relative:text;mso-position-vertical:absolute;mso-position-vertical-relative:text;v-text-anchor:top" o:gfxdata="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" stroked="f">
+              <v:shape w14:anchorId="5CEA840E" id="_x0000_s1027" type="#_x0000_t202" style="position:absolute;left:0;text-align:left;margin-left:45pt;margin-top:199.85pt;width:350pt;height:.05pt;z-index:-251658752;visibility:visible;mso-wrap-style:square;mso-wrap-distance-left:9pt;mso-wrap-distance-top:0;mso-wrap-distance-right:9pt;mso-wrap-distance-bottom:0;mso-position-horizontal:absolute;mso-position-horizontal-relative:text;mso-position-vertical:absolute;mso-position-vertical-relative:text;v-text-anchor:top" o:gfxdata="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" stroked="f">
                 <v:textbox style="mso-fit-shape-to-text:t" inset="0,0,0,0">
                   <w:txbxContent>
                     <w:p>
@@ -5136,7 +5204,15 @@
                           <w:iCs w:val="0"/>
                           <w:color w:val="auto"/>
                         </w:rPr>
-                        <w:t xml:space="preserve">Gambar 3. </w:t>
+                        <w:t xml:space="preserve">Gambar </w:t>
+                      </w:r>
+                      <w:r>
+                        <w:rPr>
+                          <w:i w:val="0"/>
+                          <w:iCs w:val="0"/>
+                          <w:color w:val="auto"/>
+                        </w:rPr>
+                        <w:t xml:space="preserve">3. </w:t>
                       </w:r>
                       <w:r>
                         <w:rPr>
@@ -5195,66 +5271,6 @@
           </mc:Fallback>
         </mc:AlternateContent>
       </w:r>
-      <w:r>
-        <w:rPr>
-          <w:noProof/>
-        </w:rPr>
-        <w:drawing>
-          <wp:anchor distT="0" distB="0" distL="114300" distR="114300" simplePos="0" relativeHeight="251635200" behindDoc="1" locked="0" layoutInCell="1" allowOverlap="1" wp14:anchorId="768207C5" wp14:editId="72E25E2F">
-            <wp:simplePos x="0" y="0"/>
-            <wp:positionH relativeFrom="column">
-              <wp:posOffset>571500</wp:posOffset>
-            </wp:positionH>
-            <wp:positionV relativeFrom="paragraph">
-              <wp:posOffset>-19050</wp:posOffset>
-            </wp:positionV>
-            <wp:extent cx="4445000" cy="2500281"/>
-            <wp:effectExtent l="0" t="0" r="0" b="0"/>
-            <wp:wrapNone/>
-            <wp:docPr id="2062846893" name="Picture 1"/>
-            <wp:cNvGraphicFramePr>
-              <a:graphicFrameLocks xmlns:a="http://schemas.openxmlformats.org/drawingml/2006/main" noChangeAspect="1"/>
-            </wp:cNvGraphicFramePr>
-            <a:graphic xmlns:a="http://schemas.openxmlformats.org/drawingml/2006/main">
-              <a:graphicData uri="http://schemas.openxmlformats.org/drawingml/2006/picture">
-                <pic:pic xmlns:pic="http://schemas.openxmlformats.org/drawingml/2006/picture">
-                  <pic:nvPicPr>
-                    <pic:cNvPr id="2062846893" name="Picture 2062846893"/>
-                    <pic:cNvPicPr/>
-                  </pic:nvPicPr>
-                  <pic:blipFill>
-                    <a:blip r:embed="rId9" cstate="print">
-                      <a:extLst>
-                        <a:ext uri="{28A0092B-C50C-407E-A947-70E740481C1C}">
-                          <a14:useLocalDpi xmlns:a14="http://schemas.microsoft.com/office/drawing/2010/main" val="0"/>
-                        </a:ext>
-                      </a:extLst>
-                    </a:blip>
-                    <a:stretch>
-                      <a:fillRect/>
-                    </a:stretch>
-                  </pic:blipFill>
-                  <pic:spPr>
-                    <a:xfrm>
-                      <a:off x="0" y="0"/>
-                      <a:ext cx="4445000" cy="2500281"/>
-                    </a:xfrm>
-                    <a:prstGeom prst="rect">
-                      <a:avLst/>
-                    </a:prstGeom>
-                  </pic:spPr>
-                </pic:pic>
-              </a:graphicData>
-            </a:graphic>
-            <wp14:sizeRelH relativeFrom="page">
-              <wp14:pctWidth>0</wp14:pctWidth>
-            </wp14:sizeRelH>
-            <wp14:sizeRelV relativeFrom="page">
-              <wp14:pctHeight>0</wp14:pctHeight>
-            </wp14:sizeRelV>
-          </wp:anchor>
-        </w:drawing>
-      </w:r>
     </w:p>
     <w:p/>
     <w:p/>
@@ -5326,7 +5342,15 @@
                                 <w:iCs w:val="0"/>
                                 <w:color w:val="auto"/>
                               </w:rPr>
-                              <w:t xml:space="preserve">Gambar 3. </w:t>
+                              <w:t xml:space="preserve">Gambar </w:t>
+                            </w:r>
+                            <w:r>
+                              <w:rPr>
+                                <w:i w:val="0"/>
+                                <w:iCs w:val="0"/>
+                                <w:color w:val="auto"/>
+                              </w:rPr>
+                              <w:t xml:space="preserve">3. </w:t>
                             </w:r>
                             <w:r>
                               <w:rPr>
@@ -5416,7 +5440,15 @@
                           <w:iCs w:val="0"/>
                           <w:color w:val="auto"/>
                         </w:rPr>
-                        <w:t xml:space="preserve">Gambar 3. </w:t>
+                        <w:t xml:space="preserve">Gambar </w:t>
+                      </w:r>
+                      <w:r>
+                        <w:rPr>
+                          <w:i w:val="0"/>
+                          <w:iCs w:val="0"/>
+                          <w:color w:val="auto"/>
+                        </w:rPr>
+                        <w:t xml:space="preserve">3. </w:t>
                       </w:r>
                       <w:r>
                         <w:rPr>
@@ -5480,7 +5512,7 @@
           <w:noProof/>
         </w:rPr>
         <w:drawing>
-          <wp:anchor distT="0" distB="0" distL="114300" distR="114300" simplePos="0" relativeHeight="251664896" behindDoc="1" locked="0" layoutInCell="1" allowOverlap="1" wp14:anchorId="3433B349" wp14:editId="7BEDF524">
+          <wp:anchor distT="0" distB="0" distL="114300" distR="114300" simplePos="0" relativeHeight="251664896" behindDoc="1" locked="0" layoutInCell="1" allowOverlap="1" wp14:anchorId="3433B349" wp14:editId="592F1469">
             <wp:simplePos x="0" y="0"/>
             <wp:positionH relativeFrom="column">
               <wp:posOffset>1637666</wp:posOffset>
@@ -5558,7 +5590,7 @@
           <w:noProof/>
         </w:rPr>
         <w:drawing>
-          <wp:anchor distT="0" distB="0" distL="114300" distR="114300" simplePos="0" relativeHeight="251679232" behindDoc="1" locked="0" layoutInCell="1" allowOverlap="1" wp14:anchorId="51499E96" wp14:editId="78B96894">
+          <wp:anchor distT="0" distB="0" distL="114300" distR="114300" simplePos="0" relativeHeight="251679232" behindDoc="1" locked="0" layoutInCell="1" allowOverlap="1" wp14:anchorId="51499E96" wp14:editId="116134B1">
             <wp:simplePos x="0" y="0"/>
             <wp:positionH relativeFrom="column">
               <wp:posOffset>1503365</wp:posOffset>
@@ -5682,7 +5714,15 @@
                                 <w:iCs w:val="0"/>
                                 <w:color w:val="auto"/>
                               </w:rPr>
-                              <w:t xml:space="preserve">Gambar 3. </w:t>
+                              <w:t xml:space="preserve">Gambar </w:t>
+                            </w:r>
+                            <w:r>
+                              <w:rPr>
+                                <w:i w:val="0"/>
+                                <w:iCs w:val="0"/>
+                                <w:color w:val="auto"/>
+                              </w:rPr>
+                              <w:t xml:space="preserve">3. </w:t>
                             </w:r>
                             <w:r>
                               <w:rPr>
@@ -5780,7 +5820,15 @@
                           <w:iCs w:val="0"/>
                           <w:color w:val="auto"/>
                         </w:rPr>
-                        <w:t xml:space="preserve">Gambar 3. </w:t>
+                        <w:t xml:space="preserve">Gambar </w:t>
+                      </w:r>
+                      <w:r>
+                        <w:rPr>
+                          <w:i w:val="0"/>
+                          <w:iCs w:val="0"/>
+                          <w:color w:val="auto"/>
+                        </w:rPr>
+                        <w:t xml:space="preserve">3. </w:t>
                       </w:r>
                       <w:r>
                         <w:rPr>

</xml_diff>